<commit_message>
Update UI components and project status
</commit_message>
<xml_diff>
--- a/Kavaach project status report.docx
+++ b/Kavaach project status report.docx
@@ -785,6 +785,14 @@
                 <w:szCs w:val="20"/>
               </w:rPr>
             </w:pPr>
+            <w:r>
+              <w:rPr>
+                <w:rFonts w:ascii="Segoe UI" w:hAnsi="Segoe UI" w:cs="Segoe UI"/>
+                <w:sz w:val="20"/>
+                <w:szCs w:val="20"/>
+              </w:rPr>
+              <w:t>Focus on testing the application on different Android devices to ensure the UI is responsive</w:t>
+            </w:r>
           </w:p>
         </w:tc>
       </w:tr>
@@ -836,6 +844,115 @@
                 <w:szCs w:val="20"/>
               </w:rPr>
             </w:pPr>
+            <w:r>
+              <w:rPr>
+                <w:rFonts w:ascii="Segoe UI" w:hAnsi="Segoe UI" w:cs="Segoe UI"/>
+                <w:sz w:val="20"/>
+                <w:szCs w:val="20"/>
+              </w:rPr>
+              <w:t>Use Firebase's auto-generated </w:t>
+            </w:r>
+            <w:r>
+              <w:rPr>
+                <w:rFonts w:ascii="Segoe UI" w:hAnsi="Segoe UI" w:cs="Segoe UI"/>
+                <w:b/>
+                <w:bCs/>
+                <w:sz w:val="20"/>
+                <w:szCs w:val="20"/>
+              </w:rPr>
+              <w:t>UUIDs as</w:t>
+            </w:r>
+            <w:r>
+              <w:rPr>
+                <w:rFonts w:ascii="Segoe UI" w:hAnsi="Segoe UI" w:cs="Segoe UI"/>
+                <w:b/>
+                <w:bCs/>
+                <w:sz w:val="20"/>
+                <w:szCs w:val="20"/>
+              </w:rPr>
+              <w:t xml:space="preserve"> </w:t>
+            </w:r>
+            <w:r>
+              <w:rPr>
+                <w:rFonts w:ascii="Segoe UI" w:hAnsi="Segoe UI" w:cs="Segoe UI"/>
+                <w:b/>
+                <w:bCs/>
+                <w:sz w:val="20"/>
+                <w:szCs w:val="20"/>
+              </w:rPr>
+              <w:t>Primary Keys</w:t>
+            </w:r>
+            <w:r>
+              <w:rPr>
+                <w:rFonts w:ascii="Segoe UI" w:hAnsi="Segoe UI" w:cs="Segoe UI"/>
+                <w:sz w:val="20"/>
+                <w:szCs w:val="20"/>
+              </w:rPr>
+              <w:t> for all documents to ensure global uniqueness, and indexes on </w:t>
+            </w:r>
+            <w:proofErr w:type="spellStart"/>
+            <w:r>
+              <w:rPr>
+                <w:rFonts w:ascii="Segoe UI" w:hAnsi="Segoe UI" w:cs="Segoe UI"/>
+                <w:sz w:val="20"/>
+                <w:szCs w:val="20"/>
+              </w:rPr>
+              <w:t>childId</w:t>
+            </w:r>
+            <w:proofErr w:type="spellEnd"/>
+          </w:p>
+          <w:p>
+            <w:pPr>
+              <w:rPr>
+                <w:rFonts w:ascii="Segoe UI" w:hAnsi="Segoe UI" w:cs="Segoe UI"/>
+                <w:sz w:val="20"/>
+                <w:szCs w:val="20"/>
+              </w:rPr>
+            </w:pPr>
+            <w:r>
+              <w:rPr>
+                <w:rFonts w:ascii="Segoe UI" w:hAnsi="Segoe UI" w:cs="Segoe UI"/>
+                <w:sz w:val="20"/>
+                <w:szCs w:val="20"/>
+              </w:rPr>
+              <w:t>and </w:t>
+            </w:r>
+            <w:proofErr w:type="spellStart"/>
+            <w:r>
+              <w:rPr>
+                <w:rFonts w:ascii="Segoe UI" w:hAnsi="Segoe UI" w:cs="Segoe UI"/>
+                <w:sz w:val="20"/>
+                <w:szCs w:val="20"/>
+              </w:rPr>
+              <w:t>parentId</w:t>
+            </w:r>
+            <w:proofErr w:type="spellEnd"/>
+            <w:r>
+              <w:rPr>
+                <w:rFonts w:ascii="Segoe UI" w:hAnsi="Segoe UI" w:cs="Segoe UI"/>
+                <w:sz w:val="20"/>
+                <w:szCs w:val="20"/>
+              </w:rPr>
+              <w:t xml:space="preserve"> </w:t>
+            </w:r>
+            <w:r>
+              <w:rPr>
+                <w:rFonts w:ascii="Segoe UI" w:hAnsi="Segoe UI" w:cs="Segoe UI"/>
+                <w:sz w:val="20"/>
+                <w:szCs w:val="20"/>
+              </w:rPr>
+              <w:t>as </w:t>
+            </w:r>
+            <w:r>
+              <w:rPr>
+                <w:rFonts w:ascii="Segoe UI" w:hAnsi="Segoe UI" w:cs="Segoe UI"/>
+                <w:b/>
+                <w:bCs/>
+                <w:sz w:val="20"/>
+                <w:szCs w:val="20"/>
+              </w:rPr>
+              <w:t>Secondary</w:t>
+            </w:r>
           </w:p>
         </w:tc>
       </w:tr>
@@ -887,6 +1004,14 @@
                 <w:szCs w:val="20"/>
               </w:rPr>
             </w:pPr>
+            <w:r>
+              <w:rPr>
+                <w:rFonts w:ascii="Segoe UI" w:hAnsi="Segoe UI" w:cs="Segoe UI"/>
+                <w:sz w:val="20"/>
+                <w:szCs w:val="20"/>
+              </w:rPr>
+              <w:t xml:space="preserve">Implement local caching so parents can view their child’s vaccination history even without internet access </w:t>
+            </w:r>
           </w:p>
         </w:tc>
       </w:tr>

</xml_diff>